<commit_message>
Apply second external review and add BBS damage reports
State what the BBS yearbook says about crop cuts, area and production, and
treat the rest of the mechanism as a hypothesis. Add BBS's damage reports for
2016, 2017 and 2022, with their own notebook, and report the repeated Chandpur
hybrid area in 2016-17, keeping the value as printed.

Describe randomisation inference and synthetic control exactly, explain the
sample sizes and pass labels, summarise the required checks, separate the two
questions of association and size, and distinguish spatial clusters before and
after correction. Rename satellite crop loss as satellite greenness loss.
</commit_message>
<xml_diff>
--- a/paper/Highlights.docx
+++ b/paper/Highlights.docx
@@ -32,7 +32,7 @@
         </w:numPr>
       </w:pPr>
       <w:r>
-        <w:t xml:space="preserve">A satellite crop-loss measure and published damage figures support this loss</w:t>
+        <w:t xml:space="preserve">BBS damage reports and satellite greenness loss support this loss</w:t>
       </w:r>
     </w:p>
     <w:p>
@@ -44,7 +44,7 @@
         </w:numPr>
       </w:pPr>
       <w:r>
-        <w:t xml:space="preserve">Other large floods left no fall in area, so no general rule is established</w:t>
+        <w:t xml:space="preserve">The 2016 and 2022 flood years showed no comparable fall, so no general rule holds</w:t>
       </w:r>
     </w:p>
     <w:p>
@@ -56,7 +56,7 @@
         </w:numPr>
       </w:pPr>
       <w:r>
-        <w:t xml:space="preserve">Exploratory results suggest that water arriving before harvest does the damage</w:t>
+        <w:t xml:space="preserve">Exploratory results point to flood timing, a hypothesis that rests on 2017</w:t>
       </w:r>
     </w:p>
     <w:p>
@@ -68,7 +68,7 @@
         </w:numPr>
       </w:pPr>
       <w:r>
-        <w:t xml:space="preserve">Yield alone can miss the largest flood losses, so track area and production too</w:t>
+        <w:t xml:space="preserve">Yield alone can miss large flood losses, so track area and production too</w:t>
       </w:r>
     </w:p>
     <w:bookmarkEnd w:id="9"/>

</xml_diff>